<commit_message>
Update naztech.com.au Daily Tasks doc — homepage as location-page template + neutrality fixes
Client switched the location-page template from Pakenham to the homepage. Also
found and flagged the homepage's industrial/commercial skew (empty brand grid,
zero light-automotive equipment coverage, exclusionary "Commercial Operators"
heading) with 4 new annotated screenshots covering hero, brand grid, equipment
lists, and industries grid. Capability file updated with the general principle:
re-check template imagery/copy balance whenever the template selection changes.

Co-Authored-By: Claude Sonnet 5 <noreply@anthropic.com>
</commit_message>
<xml_diff>
--- a/clients/naztech.com.au/daily-task/Naztech.com.au - Daily Tasks.docx
+++ b/clients/naztech.com.au/daily-task/Naztech.com.au - Daily Tasks.docx
@@ -16,7 +16,7 @@
           <w:b w:val="0"/>
           <w:sz w:val="20"/>
         </w:rPr>
-        <w:t>Prepared for developer handoff. Source: Naztech.com.au-Keyword-URL-Meta.xlsx, sheet 'Meta Data' only. Live site checked 9 Jul 2026.</w:t>
+        <w:t>Prepared for developer handoff. Source: Naztech.com.au-Keyword-URL-Meta.xlsx, sheet 'Meta Data' only. Live site checked 9 Jul 2026. Updated 9 Jul 2026: homepage is now the template for all location pages, plus homepage imagery/equipment-coverage neutrality fixes.</w:t>
       </w:r>
     </w:p>
     <w:p/>
@@ -58,7 +58,7 @@
           <w:b/>
           <w:color w:val="C00000"/>
         </w:rPr>
-        <w:t>Note: this page (Pakenham) is also the structural TEMPLATE for the entire mobile-auto-electrician suburb silo — see Section 2 and the annotated screenshot in Section 6.</w:t>
+        <w:t>Note: the Pakenham page's CONTENT should also be rebuilt to match the new homepage-based template (Section 2) — its current lean layout ("Services in Pakenham:" + "Why Choose NAZTECH" only) is being replaced as the location-page standard. This is a content update on top of the URL rename above, not a separate task.</w:t>
       </w:r>
     </w:p>
     <w:p/>
@@ -67,7 +67,7 @@
         <w:pStyle w:val="Heading1"/>
       </w:pPr>
       <w:r>
-        <w:t>2. Create new location pages (using Pakenham as the template)</w:t>
+        <w:t>2. Create new location pages (using the Homepage as the template)</w:t>
       </w:r>
     </w:p>
     <w:p>
@@ -75,7 +75,16 @@
         <w:rPr>
           <w:b w:val="0"/>
         </w:rPr>
-        <w:t>Using https://naztech.com.au/pakenham/ (soon to be /mobile-auto-electrician-pakenham/) as a template, create these new pages and add content in them. Keep the same layout/section structure: H1 'Mobile Auto Electrician in [Suburb]', a 'Services in [Suburb]:' service-tile grid, and a 'Why Choose NAZTECH in [Suburb]?' USP block. Swap the suburb name throughout and localise the intro paragraph per suburb.</w:t>
+        <w:t>Updated instruction: use https://naztech.com.au/ (the homepage) as the template for every new location page, not the Pakenham page. Keep the homepage's structure and section order (hero, services tiles, brands/equipment grid, equipment-list columns, industries grid, reviews, FAQ, CTA) but localise it: swap in the suburb name throughout (H1, intro, CTA copy), and keep the fixed hero photo but update its copy per Section 3 below.</w:t>
+      </w:r>
+    </w:p>
+    <w:p>
+      <w:r>
+        <w:rPr>
+          <w:b/>
+          <w:color w:val="C00000"/>
+        </w:rPr>
+        <w:t>Do not literally duplicate every homepage section in full on all 42 suburb pages — that will read as duplicate content across the site. Trim the equipment-list columns and industries grid down to what's realistic/relevant for that page's service silo (e.g. a car-aircon-regas suburb page does not need the full mining/agriculture equipment lists), while keeping the same visual structure and section headings pattern.</w:t>
       </w:r>
     </w:p>
     <w:p>
@@ -212,7 +221,7 @@
           <w:b/>
           <w:color w:val="C00000"/>
         </w:rPr>
-        <w:t>No page in this silo exists yet — not even for Pakenham. Build the FIRST page in this list as the new template (following the same structure as the Pakenham auto-electrician page, but with air conditioning/regas service content), then replicate it across the remaining 13 suburbs.</w:t>
+        <w:t>No page in this silo exists yet — not even for Pakenham. Build the FIRST page in this list using the homepage template, then replicate it across the remaining 13 suburbs.</w:t>
       </w:r>
     </w:p>
     <w:p>
@@ -341,7 +350,7 @@
           <w:b/>
           <w:color w:val="C00000"/>
         </w:rPr>
-        <w:t>Same as above — no page in this silo exists yet. Build the first suburb page as the new template (battery replacement service content, same structural layout), then replicate across the remaining 13 suburbs.</w:t>
+        <w:t>Same as above — no page in this silo exists yet. Build the first suburb page using the homepage template, then replicate across the remaining 13 suburbs.</w:t>
       </w:r>
     </w:p>
     <w:p>
@@ -470,7 +479,7 @@
         <w:rPr>
           <w:b w:val="0"/>
         </w:rPr>
-        <w:t>These are broader, non-suburb-specific pages — one per service silo. They should be more comprehensive than the suburb pages (equipment lists, FAQ, reviews), similar in depth to the existing /auto-electrical-services/ and /mobile-air-conditioning-repairs-servicing/ pages. Note: those two existing pages are NOT being redirected or renamed — they stay live as-is. Use them only as a structural/content-depth reference, not as a redirect source.</w:t>
+        <w:t>Same rule applies — use the homepage as the structural template (trimmed per silo, as above). These are broader, non-suburb-specific pages, one per service silo. Note: /auto-electrical-services/ and /mobile-air-conditioning-repairs-servicing/ are NOT being redirected or renamed — they stay live as-is.</w:t>
       </w:r>
     </w:p>
     <w:p>
@@ -478,7 +487,7 @@
         <w:pStyle w:val="ListNumber"/>
       </w:pPr>
       <w:r>
-        <w:t>https://naztech.com.au/car-aircon-regas/ — target keyword: "car aircon regas south east melbourne &amp; gippsland". New page (marked new in the Meta Data sheet). Note the /cars/ → /car-aircon-regas/ rename in Section 1 covers the URL move; this page needs full new content built to this richer template depth.</w:t>
+        <w:t>https://naztech.com.au/car-aircon-regas/ — target keyword: "car aircon regas south east melbourne &amp; gippsland". New page (marked new in the Meta Data sheet).</w:t>
       </w:r>
     </w:p>
     <w:p>
@@ -495,7 +504,7 @@
           <w:b/>
           <w:color w:val="C00000"/>
         </w:rPr>
-        <w:t>⚠️ Needs confirmation before dev starts: https://naztech.com.au/mobile-auto-electrician/ — target keyword: "mobile auto electrician south east melbourne &amp; gippsland". This URL currently returns 404 (does not exist), but it is NOT marked yellow/new in the Meta Data sheet, and there is no "Current URL" redirect note pointing to it either (unlike the other two rows above it). The existing /auto-electrical-services/ page is a very close content match for this exact target keyword. Please confirm with the client/analyst whether this should be (a) a new page built from scratch, or (b) a rename+redirect of /auto-electrical-services/ — the Meta Data sheet is inconsistent on this one specific row.</w:t>
+        <w:t>⚠️ Needs confirmation before dev starts: https://naztech.com.au/mobile-auto-electrician/ — target keyword: "mobile auto electrician south east melbourne &amp; gippsland". This URL currently returns 404 (does not exist), but it is NOT marked yellow/new in the Meta Data sheet, and there is no "Current URL" redirect note pointing to it either. The existing /auto-electrical-services/ page is a very close content match for this exact target keyword. Please confirm with the client/analyst whether this should be (a) a new page built from the homepage template, or (b) a rename+redirect of /auto-electrical-services/.</w:t>
       </w:r>
     </w:p>
     <w:p/>
@@ -504,7 +513,228 @@
         <w:pStyle w:val="Heading1"/>
       </w:pPr>
       <w:r>
-        <w:t>4. Update content on existing pages (no URL change)</w:t>
+        <w:t>4. Homepage — make imagery &amp; equipment coverage neutral across all vehicle types</w:t>
+      </w:r>
+    </w:p>
+    <w:p>
+      <w:r>
+        <w:rPr>
+          <w:b w:val="0"/>
+        </w:rPr>
+        <w:t>The homepage currently reads as industrial/commercial-only. NAZTECH covers three sectors — Light Automotive (cars, 4WDs, caravans, motorhomes, marine), Heavy Transport (trucks, trailers) and Heavy Equipment (earthmoving, mining, construction, farming) — but the homepage's hero image, equipment lists, brand grid and industries grid are almost entirely weighted toward Heavy Equipment. Update as follows:</w:t>
+      </w:r>
+    </w:p>
+    <w:p>
+      <w:r>
+        <w:rPr>
+          <w:b/>
+        </w:rPr>
+        <w:t>4a. Hero background image</w:t>
+      </w:r>
+    </w:p>
+    <w:p>
+      <w:r>
+        <w:rPr>
+          <w:b w:val="0"/>
+        </w:rPr>
+        <w:t>Update https://naztech.com.au/ as per this screenshot:</w:t>
+      </w:r>
+    </w:p>
+    <w:p>
+      <w:r>
+        <w:drawing>
+          <wp:inline xmlns:a="http://schemas.openxmlformats.org/drawingml/2006/main" xmlns:pic="http://schemas.openxmlformats.org/drawingml/2006/picture">
+            <wp:extent cx="5943600" cy="4210050"/>
+            <wp:docPr id="1" name="Picture 1"/>
+            <wp:cNvGraphicFramePr>
+              <a:graphicFrameLocks noChangeAspect="1"/>
+            </wp:cNvGraphicFramePr>
+            <a:graphic>
+              <a:graphicData uri="http://schemas.openxmlformats.org/drawingml/2006/picture">
+                <pic:pic>
+                  <pic:nvPicPr>
+                    <pic:cNvPr id="0" name="screenshot-hero-neutral-annotated.png"/>
+                    <pic:cNvPicPr/>
+                  </pic:nvPicPr>
+                  <pic:blipFill>
+                    <a:blip r:embed="rId9"/>
+                    <a:stretch>
+                      <a:fillRect/>
+                    </a:stretch>
+                  </pic:blipFill>
+                  <pic:spPr>
+                    <a:xfrm>
+                      <a:off x="0" y="0"/>
+                      <a:ext cx="5943600" cy="4210050"/>
+                    </a:xfrm>
+                    <a:prstGeom prst="rect"/>
+                  </pic:spPr>
+                </pic:pic>
+              </a:graphicData>
+            </a:graphic>
+          </wp:inline>
+        </w:drawing>
+      </w:r>
+    </w:p>
+    <w:p/>
+    <w:p>
+      <w:r>
+        <w:rPr>
+          <w:b/>
+        </w:rPr>
+        <w:t>4b. "Brands &amp; Equipment We Work On" grid — currently completely empty</w:t>
+      </w:r>
+    </w:p>
+    <w:p>
+      <w:r>
+        <w:drawing>
+          <wp:inline xmlns:a="http://schemas.openxmlformats.org/drawingml/2006/main" xmlns:pic="http://schemas.openxmlformats.org/drawingml/2006/picture">
+            <wp:extent cx="5943600" cy="3343275"/>
+            <wp:docPr id="2" name="Picture 2"/>
+            <wp:cNvGraphicFramePr>
+              <a:graphicFrameLocks noChangeAspect="1"/>
+            </wp:cNvGraphicFramePr>
+            <a:graphic>
+              <a:graphicData uri="http://schemas.openxmlformats.org/drawingml/2006/picture">
+                <pic:pic>
+                  <pic:nvPicPr>
+                    <pic:cNvPr id="0" name="screenshot-brands-grid-annotated.png"/>
+                    <pic:cNvPicPr/>
+                  </pic:nvPicPr>
+                  <pic:blipFill>
+                    <a:blip r:embed="rId10"/>
+                    <a:stretch>
+                      <a:fillRect/>
+                    </a:stretch>
+                  </pic:blipFill>
+                  <pic:spPr>
+                    <a:xfrm>
+                      <a:off x="0" y="0"/>
+                      <a:ext cx="5943600" cy="3343275"/>
+                    </a:xfrm>
+                    <a:prstGeom prst="rect"/>
+                  </pic:spPr>
+                </pic:pic>
+              </a:graphicData>
+            </a:graphic>
+          </wp:inline>
+        </w:drawing>
+      </w:r>
+    </w:p>
+    <w:p/>
+    <w:p>
+      <w:r>
+        <w:rPr>
+          <w:b/>
+        </w:rPr>
+        <w:t>4c. "Your Mobile Auto Electrician in Melbourne &amp; Victoria" equipment-list columns</w:t>
+      </w:r>
+    </w:p>
+    <w:p>
+      <w:r>
+        <w:drawing>
+          <wp:inline xmlns:a="http://schemas.openxmlformats.org/drawingml/2006/main" xmlns:pic="http://schemas.openxmlformats.org/drawingml/2006/picture">
+            <wp:extent cx="5943600" cy="4086225"/>
+            <wp:docPr id="3" name="Picture 3"/>
+            <wp:cNvGraphicFramePr>
+              <a:graphicFrameLocks noChangeAspect="1"/>
+            </wp:cNvGraphicFramePr>
+            <a:graphic>
+              <a:graphicData uri="http://schemas.openxmlformats.org/drawingml/2006/picture">
+                <pic:pic>
+                  <pic:nvPicPr>
+                    <pic:cNvPr id="0" name="screenshot-equipment-lists-annotated.png"/>
+                    <pic:cNvPicPr/>
+                  </pic:nvPicPr>
+                  <pic:blipFill>
+                    <a:blip r:embed="rId11"/>
+                    <a:stretch>
+                      <a:fillRect/>
+                    </a:stretch>
+                  </pic:blipFill>
+                  <pic:spPr>
+                    <a:xfrm>
+                      <a:off x="0" y="0"/>
+                      <a:ext cx="5943600" cy="4086225"/>
+                    </a:xfrm>
+                    <a:prstGeom prst="rect"/>
+                  </pic:spPr>
+                </pic:pic>
+              </a:graphicData>
+            </a:graphic>
+          </wp:inline>
+        </w:drawing>
+      </w:r>
+    </w:p>
+    <w:p/>
+    <w:p>
+      <w:r>
+        <w:rPr>
+          <w:b/>
+        </w:rPr>
+        <w:t>4d. "Industries &amp; Equipment We Service" grid</w:t>
+      </w:r>
+    </w:p>
+    <w:p>
+      <w:r>
+        <w:drawing>
+          <wp:inline xmlns:a="http://schemas.openxmlformats.org/drawingml/2006/main" xmlns:pic="http://schemas.openxmlformats.org/drawingml/2006/picture">
+            <wp:extent cx="5943600" cy="3962400"/>
+            <wp:docPr id="4" name="Picture 4"/>
+            <wp:cNvGraphicFramePr>
+              <a:graphicFrameLocks noChangeAspect="1"/>
+            </wp:cNvGraphicFramePr>
+            <a:graphic>
+              <a:graphicData uri="http://schemas.openxmlformats.org/drawingml/2006/picture">
+                <pic:pic>
+                  <pic:nvPicPr>
+                    <pic:cNvPr id="0" name="screenshot-industries-grid-annotated.png"/>
+                    <pic:cNvPicPr/>
+                  </pic:nvPicPr>
+                  <pic:blipFill>
+                    <a:blip r:embed="rId12"/>
+                    <a:stretch>
+                      <a:fillRect/>
+                    </a:stretch>
+                  </pic:blipFill>
+                  <pic:spPr>
+                    <a:xfrm>
+                      <a:off x="0" y="0"/>
+                      <a:ext cx="5943600" cy="3962400"/>
+                    </a:xfrm>
+                    <a:prstGeom prst="rect"/>
+                  </pic:spPr>
+                </pic:pic>
+              </a:graphicData>
+            </a:graphic>
+          </wp:inline>
+        </w:drawing>
+      </w:r>
+    </w:p>
+    <w:p/>
+    <w:p>
+      <w:r>
+        <w:rPr>
+          <w:b/>
+        </w:rPr>
+        <w:t>4e. Reviews section heading</w:t>
+      </w:r>
+    </w:p>
+    <w:p>
+      <w:pPr>
+        <w:pStyle w:val="ListBullet"/>
+      </w:pPr>
+      <w:r>
+        <w:t>The reviews section heading "Trusted by Commercial Operators Across Melbourne" excludes private/light-vehicle customers by name. Reword to something neutral, e.g. "Trusted Across Melbourne &amp; Victoria" — final wording to be confirmed with content team.</w:t>
+      </w:r>
+    </w:p>
+    <w:p/>
+    <w:p>
+      <w:pPr>
+        <w:pStyle w:val="Heading1"/>
+      </w:pPr>
+      <w:r>
+        <w:t>5. Update content on other existing pages (no URL change)</w:t>
       </w:r>
     </w:p>
     <w:p>
@@ -513,14 +743,6 @@
           <w:b w:val="0"/>
         </w:rPr>
         <w:t>Make a backup of the contents of the following pages, then update the content in place once new copy is ready. These pages already exist at the correct target URL — no rename or redirect needed.</w:t>
-      </w:r>
-    </w:p>
-    <w:p>
-      <w:pPr>
-        <w:pStyle w:val="ListNumber"/>
-      </w:pPr>
-      <w:r>
-        <w:t>https://naztech.com.au/ (Homepage) — target keyword: "mobile auto electrical &amp; air conditioning south east melbourne &amp; gippsland". Current H1 ("Mobile Auto Electrical &amp; Air Conditioning for Heavy Equipment, Fleet &amp; Plant") targets equipment type, not the geographic modifier — H1 and hero copy need to be realigned to the target keyword. See annotated screenshot in Section 6.</w:t>
       </w:r>
     </w:p>
     <w:p>
@@ -545,7 +767,7 @@
         <w:pStyle w:val="Heading1"/>
       </w:pPr>
       <w:r>
-        <w:t>5. Rebuild /areas-we-serve/ as the suburb hub page</w:t>
+        <w:t>6. Rebuild /areas-we-serve/ as the suburb hub page</w:t>
       </w:r>
     </w:p>
     <w:p>
@@ -578,7 +800,7 @@
         <w:pStyle w:val="Heading1"/>
       </w:pPr>
       <w:r>
-        <w:t>6. Homepage — annotated changes</w:t>
+        <w:t>7. Homepage — other on-page changes (H1, nav, footer)</w:t>
       </w:r>
     </w:p>
     <w:p>
@@ -594,7 +816,7 @@
         <w:drawing>
           <wp:inline xmlns:a="http://schemas.openxmlformats.org/drawingml/2006/main" xmlns:pic="http://schemas.openxmlformats.org/drawingml/2006/picture">
             <wp:extent cx="5943600" cy="38654038"/>
-            <wp:docPr id="1" name="Picture 1"/>
+            <wp:docPr id="5" name="Picture 5"/>
             <wp:cNvGraphicFramePr>
               <a:graphicFrameLocks noChangeAspect="1"/>
             </wp:cNvGraphicFramePr>
@@ -606,7 +828,7 @@
                     <pic:cNvPicPr/>
                   </pic:nvPicPr>
                   <pic:blipFill>
-                    <a:blip r:embed="rId9"/>
+                    <a:blip r:embed="rId13"/>
                     <a:stretch>
                       <a:fillRect/>
                     </a:stretch>
@@ -631,15 +853,16 @@
         <w:pStyle w:val="Heading1"/>
       </w:pPr>
       <w:r>
-        <w:t>7. Suburb page template — annotated reference</w:t>
+        <w:t>8. Reference — previous suburb page structure (Pakenham, being replaced)</w:t>
       </w:r>
     </w:p>
     <w:p>
       <w:r>
         <w:rPr>
-          <w:b w:val="0"/>
+          <w:b/>
+          <w:color w:val="C00000"/>
         </w:rPr>
-        <w:t>https://naztech.com.au/pakenham/ (soon to be /mobile-auto-electrician-pakenham/) shown below as the structural template for all new suburb pages in Section 2:</w:t>
+        <w:t>https://naztech.com.au/pakenham/ shown below for reference only — this simpler layout is being superseded by the homepage-based template (Section 2). Do not use this as the template going forward.</w:t>
       </w:r>
     </w:p>
     <w:p>
@@ -647,7 +870,7 @@
         <w:drawing>
           <wp:inline xmlns:a="http://schemas.openxmlformats.org/drawingml/2006/main" xmlns:pic="http://schemas.openxmlformats.org/drawingml/2006/picture">
             <wp:extent cx="5943600" cy="7371715"/>
-            <wp:docPr id="2" name="Picture 2"/>
+            <wp:docPr id="6" name="Picture 6"/>
             <wp:cNvGraphicFramePr>
               <a:graphicFrameLocks noChangeAspect="1"/>
             </wp:cNvGraphicFramePr>
@@ -659,7 +882,7 @@
                     <pic:cNvPicPr/>
                   </pic:nvPicPr>
                   <pic:blipFill>
-                    <a:blip r:embed="rId10"/>
+                    <a:blip r:embed="rId14"/>
                     <a:stretch>
                       <a:fillRect/>
                     </a:stretch>
@@ -684,7 +907,7 @@
         <w:pStyle w:val="Heading1"/>
       </w:pPr>
       <w:r>
-        <w:t>8. Main navigation changes</w:t>
+        <w:t>9. Main navigation changes</w:t>
       </w:r>
     </w:p>
     <w:p>
@@ -724,7 +947,7 @@
         <w:pStyle w:val="ListBullet"/>
       </w:pPr>
       <w:r>
-        <w:t>Keep "Areas we serve" under Services as-is — it will link out to all suburb pages once rebuilt (Section 5).</w:t>
+        <w:t>Keep "Areas we serve" under Services as-is — it will link out to all suburb pages once rebuilt (Section 6).</w:t>
       </w:r>
     </w:p>
     <w:p/>
@@ -733,7 +956,7 @@
         <w:pStyle w:val="Heading1"/>
       </w:pPr>
       <w:r>
-        <w:t>9. Footer changes</w:t>
+        <w:t>10. Footer changes</w:t>
       </w:r>
     </w:p>
     <w:p>
@@ -766,7 +989,7 @@
         <w:pStyle w:val="Heading1"/>
       </w:pPr>
       <w:r>
-        <w:t>10. Open items — confirm before/during dev</w:t>
+        <w:t>11. Open items — confirm before/during dev</w:t>
       </w:r>
     </w:p>
     <w:p>
@@ -790,7 +1013,15 @@
         <w:pStyle w:val="ListBullet"/>
       </w:pPr>
       <w:r>
-        <w:t>Titles, meta descriptions, H1s, H2s, H3s and interlinking words are blank for every row in the Meta Data sheet — this daily task covers URL structure, redirects, templates, nav and footer only. Actual page copy is a separate, upcoming content deliverable.</w:t>
+        <w:t>Titles, meta descriptions, H1s, H2s, H3s and interlinking words are blank for every row in the Meta Data sheet — this daily task covers URL structure, redirects, templates, nav, footer and homepage imagery only. Actual page copy is a separate, upcoming content deliverable.</w:t>
+      </w:r>
+    </w:p>
+    <w:p>
+      <w:pPr>
+        <w:pStyle w:val="ListBullet"/>
+      </w:pPr>
+      <w:r>
+        <w:t>Confirm final hero image / brand logo assets with the client before dev implements Section 4 — this doc specifies WHAT needs to change and WHERE, not the final image files themselves.</w:t>
       </w:r>
     </w:p>
     <w:sectPr>

</xml_diff>